<commit_message>
Refatoração dos relatórios do Itinerário: wrapper queries para filtros exatos, reordenação de colunas e tratamento de valores nulos
</commit_message>
<xml_diff>
--- a/dados/modelo_parecer_deferido_it.docx
+++ b/dados/modelo_parecer_deferido_it.docx
@@ -557,9 +557,8 @@
           <w:szCs w:val="24"/>
           <w:lang w:eastAsia="ar-SA"/>
         </w:rPr>
-        <w:t>{{EVENTO</w:t>
+        <w:t>,</w:t>
       </w:r>
-      <w:proofErr w:type="gramStart"/>
       <w:r>
         <w:rPr>
           <w:rFonts w:ascii="Times New Roman" w:eastAsia="Times New Roman" w:hAnsi="Times New Roman" w:cs="Times New Roman"/>
@@ -567,9 +566,8 @@
           <w:szCs w:val="24"/>
           <w:lang w:eastAsia="ar-SA"/>
         </w:rPr>
-        <w:t>}}{</w:t>
+        <w:t xml:space="preserve"> {{EVENTO}}</w:t>
       </w:r>
-      <w:proofErr w:type="gramEnd"/>
       <w:r>
         <w:rPr>
           <w:rFonts w:ascii="Times New Roman" w:eastAsia="Times New Roman" w:hAnsi="Times New Roman" w:cs="Times New Roman"/>
@@ -577,7 +575,18 @@
           <w:szCs w:val="24"/>
           <w:lang w:eastAsia="ar-SA"/>
         </w:rPr>
-        <w:t>{DATA_EVENTO}}{{PERIODO}}</w:t>
+        <w:t>,</w:t>
+      </w:r>
+      <w:bookmarkStart w:id="0" w:name="_GoBack"/>
+      <w:bookmarkEnd w:id="0"/>
+      <w:r>
+        <w:rPr>
+          <w:rFonts w:ascii="Times New Roman" w:eastAsia="Times New Roman" w:hAnsi="Times New Roman" w:cs="Times New Roman"/>
+          <w:sz w:val="24"/>
+          <w:szCs w:val="24"/>
+          <w:lang w:eastAsia="ar-SA"/>
+        </w:rPr>
+        <w:t xml:space="preserve"> {{DATA_EVENTO}} {{PERIODO}}</w:t>
       </w:r>
       <w:r>
         <w:rPr>
@@ -595,36 +604,7 @@
           <w:szCs w:val="24"/>
           <w:lang w:eastAsia="ar-SA"/>
         </w:rPr>
-        <w:t xml:space="preserve">na </w:t>
-      </w:r>
-      <w:r>
-        <w:rPr>
-          <w:rFonts w:ascii="Times New Roman" w:eastAsia="Times New Roman" w:hAnsi="Times New Roman" w:cs="Times New Roman"/>
-          <w:sz w:val="24"/>
-          <w:szCs w:val="24"/>
-          <w:lang w:eastAsia="ar-SA"/>
-        </w:rPr>
-        <w:t>{{ENDER</w:t>
-      </w:r>
-      <w:bookmarkStart w:id="0" w:name="_GoBack"/>
-      <w:bookmarkEnd w:id="0"/>
-      <w:r>
-        <w:rPr>
-          <w:rFonts w:ascii="Times New Roman" w:eastAsia="Times New Roman" w:hAnsi="Times New Roman" w:cs="Times New Roman"/>
-          <w:sz w:val="24"/>
-          <w:szCs w:val="24"/>
-          <w:lang w:eastAsia="ar-SA"/>
-        </w:rPr>
-        <w:t>ECO}}</w:t>
-      </w:r>
-      <w:r>
-        <w:rPr>
-          <w:rFonts w:ascii="Times New Roman" w:eastAsia="Times New Roman" w:hAnsi="Times New Roman" w:cs="Times New Roman"/>
-          <w:sz w:val="24"/>
-          <w:szCs w:val="24"/>
-          <w:lang w:eastAsia="ar-SA"/>
-        </w:rPr>
-        <w:t>.</w:t>
+        <w:t>na {{ENDERECO}}.</w:t>
       </w:r>
     </w:p>
     <w:p>

</xml_diff>